<commit_message>
Describe practice builds as spec demos; add LinkedIn project copy
- Case studies, lab and hub copy state the chiropractic builds are
  spec demos built from public information, not affiliated
- Palmer & Herman discovery no longer implies the practice chose the
  rollout; MedSpa is labeled as a template with placeholder contacts
- Résumé wording updated to match; linkedin-projects.md holds seven
  copy-paste LinkedIn Projects entries

Co-Authored-By: Claude Opus 5.5 <noreply@anthropic.com>
</commit_message>
<xml_diff>
--- a/public/Emmanuel_Nanadoum_Solutions_Engineer_Resume.docx
+++ b/public/Emmanuel_Nanadoum_Solutions_Engineer_Resume.docx
@@ -53,7 +53,7 @@
         </w:rPr>
         <w:t xml:space="preserve"> | </w:t>
       </w:r>
-      <w:hyperlink w:history="1" r:id="rId86kwis0xlci8yhlvrn5mg">
+      <w:hyperlink w:history="1" r:id="rId5b1xl161wt3wbunnkqk_l">
         <w:r>
           <w:rPr>
             <w:rFonts w:ascii="Arial" w:cs="Arial" w:eastAsia="Arial" w:hAnsi="Arial"/>
@@ -73,7 +73,7 @@
         </w:rPr>
         <w:t xml:space="preserve"> | </w:t>
       </w:r>
-      <w:hyperlink w:history="1" r:id="rIdmd8nmz8uk8djqqpyt6j12">
+      <w:hyperlink w:history="1" r:id="rId6fk-rl5mhj_j0jujyblm0">
         <w:r>
           <w:rPr>
             <w:rFonts w:ascii="Arial" w:cs="Arial" w:eastAsia="Arial" w:hAnsi="Arial"/>
@@ -93,7 +93,7 @@
         </w:rPr>
         <w:t xml:space="preserve"> | </w:t>
       </w:r>
-      <w:hyperlink w:history="1" r:id="rIdc6i1e2yrvx2fh9xi8xwf0">
+      <w:hyperlink w:history="1" r:id="rId9diihwyghbfrozn7qq3tf">
         <w:r>
           <w:rPr>
             <w:rFonts w:ascii="Arial" w:cs="Arial" w:eastAsia="Arial" w:hAnsi="Arial"/>
@@ -121,9 +121,9 @@
           <w:sz w:val="18"/>
           <w:szCs w:val="18"/>
         </w:rPr>
-        <w:t xml:space="preserve">Portfolio &amp; live client demos: </w:t>
-      </w:r>
-      <w:hyperlink w:history="1" r:id="rId5fsnzwqlsr2gswwyjyy46">
+        <w:t xml:space="preserve">Portfolio &amp; live demos: </w:t>
+      </w:r>
+      <w:hyperlink w:history="1" r:id="rIdymr5jorurvz-earf9fk9-">
         <w:r>
           <w:rPr>
             <w:rFonts w:ascii="Arial" w:cs="Arial" w:eastAsia="Arial" w:hAnsi="Arial"/>
@@ -164,7 +164,7 @@
           <w:sz w:val="18"/>
           <w:szCs w:val="18"/>
         </w:rPr>
-        <w:t xml:space="preserve">Customer-facing technical and sales professional with 8+ years of consultative, high-ticket selling and 4+ years designing CRM, automation, web, and AI voice solutions. Leads discovery, turns business pain into technical requirements, builds proof-of-concept demos on the prospect's own business, and guides customers from evaluation through implementation. Portfolio: six live client demo builds and a deployed AI voice product.</w:t>
+        <w:t xml:space="preserve">Customer-facing technical and sales professional with 8+ years of consultative, high-ticket selling and 4+ years designing CRM, automation, web, and AI voice solutions. Leads discovery, turns business pain into technical requirements, builds proof-of-concept demos on the prospect's own business, and guides customers from evaluation through implementation. Portfolio: six live spec demos for prospects and a deployed AI voice product.</w:t>
       </w:r>
     </w:p>
     <w:p>
@@ -390,7 +390,7 @@
           <w:sz w:val="18"/>
           <w:szCs w:val="18"/>
         </w:rPr>
-        <w:t xml:space="preserve">Build proof-of-concept demos on each prospect's own brand: six live client and reference builds, including a revenue system with a live two-way AI receptionist line, test patient form, and 13-step patient journey.</w:t>
+        <w:t xml:space="preserve">Build proof-of-concept demos on each prospect's own brand: six live spec demos and reference builds, including a revenue system with a live two-way AI receptionist line, test patient form, and 13-step patient journey.</w:t>
       </w:r>
     </w:p>
     <w:p>
@@ -710,7 +710,7 @@
         </w:rPr>
         <w:t xml:space="preserve">	</w:t>
       </w:r>
-      <w:hyperlink w:history="1" r:id="rId1quwsdplzyo1pygawris8">
+      <w:hyperlink w:history="1" r:id="rIdt4q_90phgpphttg5jogyr">
         <w:r>
           <w:rPr>
             <w:rFonts w:ascii="Arial" w:cs="Arial" w:eastAsia="Arial" w:hAnsi="Arial"/>

</xml_diff>

<commit_message>
Describe practice builds as prospect demos
The practices are about to sign, so 'prospect demo' replaces 'spec
demo, not affiliated' across case studies, lab, hub, résumé and the
LinkedIn project copy.

Co-Authored-By: Claude Opus 5.5 <noreply@anthropic.com>
</commit_message>
<xml_diff>
--- a/public/Emmanuel_Nanadoum_Solutions_Engineer_Resume.docx
+++ b/public/Emmanuel_Nanadoum_Solutions_Engineer_Resume.docx
@@ -53,7 +53,7 @@
         </w:rPr>
         <w:t xml:space="preserve"> | </w:t>
       </w:r>
-      <w:hyperlink w:history="1" r:id="rId5b1xl161wt3wbunnkqk_l">
+      <w:hyperlink w:history="1" r:id="rIde_h2aaqoqhvfpc-fr5zp-">
         <w:r>
           <w:rPr>
             <w:rFonts w:ascii="Arial" w:cs="Arial" w:eastAsia="Arial" w:hAnsi="Arial"/>
@@ -73,7 +73,7 @@
         </w:rPr>
         <w:t xml:space="preserve"> | </w:t>
       </w:r>
-      <w:hyperlink w:history="1" r:id="rId6fk-rl5mhj_j0jujyblm0">
+      <w:hyperlink w:history="1" r:id="rIdsxnwu2x-nvvqh6hsc3ov6">
         <w:r>
           <w:rPr>
             <w:rFonts w:ascii="Arial" w:cs="Arial" w:eastAsia="Arial" w:hAnsi="Arial"/>
@@ -93,7 +93,7 @@
         </w:rPr>
         <w:t xml:space="preserve"> | </w:t>
       </w:r>
-      <w:hyperlink w:history="1" r:id="rId9diihwyghbfrozn7qq3tf">
+      <w:hyperlink w:history="1" r:id="rIdpkrciepgntdph6b4i2nft">
         <w:r>
           <w:rPr>
             <w:rFonts w:ascii="Arial" w:cs="Arial" w:eastAsia="Arial" w:hAnsi="Arial"/>
@@ -123,7 +123,7 @@
         </w:rPr>
         <w:t xml:space="preserve">Portfolio &amp; live demos: </w:t>
       </w:r>
-      <w:hyperlink w:history="1" r:id="rIdymr5jorurvz-earf9fk9-">
+      <w:hyperlink w:history="1" r:id="rIdazva-gplm3fz5hoim2r5k">
         <w:r>
           <w:rPr>
             <w:rFonts w:ascii="Arial" w:cs="Arial" w:eastAsia="Arial" w:hAnsi="Arial"/>
@@ -164,7 +164,7 @@
           <w:sz w:val="18"/>
           <w:szCs w:val="18"/>
         </w:rPr>
-        <w:t xml:space="preserve">Customer-facing technical and sales professional with 8+ years of consultative, high-ticket selling and 4+ years designing CRM, automation, web, and AI voice solutions. Leads discovery, turns business pain into technical requirements, builds proof-of-concept demos on the prospect's own business, and guides customers from evaluation through implementation. Portfolio: six live spec demos for prospects and a deployed AI voice product.</w:t>
+        <w:t xml:space="preserve">Customer-facing technical and sales professional with 8+ years of consultative, high-ticket selling and 4+ years designing CRM, automation, web, and AI voice solutions. Leads discovery, turns business pain into technical requirements, builds proof-of-concept demos on the prospect's own business, and guides customers from evaluation through implementation. Portfolio: six live prospect demos and a deployed AI voice product.</w:t>
       </w:r>
     </w:p>
     <w:p>
@@ -390,7 +390,7 @@
           <w:sz w:val="18"/>
           <w:szCs w:val="18"/>
         </w:rPr>
-        <w:t xml:space="preserve">Build proof-of-concept demos on each prospect's own brand: six live spec demos and reference builds, including a revenue system with a live two-way AI receptionist line, test patient form, and 13-step patient journey.</w:t>
+        <w:t xml:space="preserve">Build proof-of-concept demos on each prospect's own brand: six live prospect demos and reference builds, including a revenue system with a live two-way AI receptionist line, test patient form, and 13-step patient journey.</w:t>
       </w:r>
     </w:p>
     <w:p>
@@ -710,7 +710,7 @@
         </w:rPr>
         <w:t xml:space="preserve">	</w:t>
       </w:r>
-      <w:hyperlink w:history="1" r:id="rIdt4q_90phgpphttg5jogyr">
+      <w:hyperlink w:history="1" r:id="rIdxl-oovjry0xhcokb8j74-">
         <w:r>
           <w:rPr>
             <w:rFonts w:ascii="Arial" w:cs="Arial" w:eastAsia="Arial" w:hAnsi="Arial"/>

</xml_diff>

<commit_message>
Mirror demos to own Vercel; even résumé bullets
- demos/: exact static mirrors of the six GHL AI Studio demos with
  GHL media pulled local, form posts routed to /api/demo-lead, the
  dead Cactus booking link replaced, and MedSpa placeholders labeled
  as a template preview (mirror.mjs, patch.mjs, test-mirrors.mjs)
- Portfolio links now point to blair-demo-*.vercel.app
- Résumé: four bullets per role, still one page

Co-Authored-By: Claude Opus 5.5 <noreply@anthropic.com>
</commit_message>
<xml_diff>
--- a/public/Emmanuel_Nanadoum_Solutions_Engineer_Resume.docx
+++ b/public/Emmanuel_Nanadoum_Solutions_Engineer_Resume.docx
@@ -53,7 +53,7 @@
         </w:rPr>
         <w:t xml:space="preserve"> | </w:t>
       </w:r>
-      <w:hyperlink w:history="1" r:id="rIde_h2aaqoqhvfpc-fr5zp-">
+      <w:hyperlink w:history="1" r:id="rIdrj2o4s6cqjmpec9yaiyac">
         <w:r>
           <w:rPr>
             <w:rFonts w:ascii="Arial" w:cs="Arial" w:eastAsia="Arial" w:hAnsi="Arial"/>
@@ -73,7 +73,7 @@
         </w:rPr>
         <w:t xml:space="preserve"> | </w:t>
       </w:r>
-      <w:hyperlink w:history="1" r:id="rIdsxnwu2x-nvvqh6hsc3ov6">
+      <w:hyperlink w:history="1" r:id="rId2rr1edpvukopsbpjw5iv5">
         <w:r>
           <w:rPr>
             <w:rFonts w:ascii="Arial" w:cs="Arial" w:eastAsia="Arial" w:hAnsi="Arial"/>
@@ -93,7 +93,7 @@
         </w:rPr>
         <w:t xml:space="preserve"> | </w:t>
       </w:r>
-      <w:hyperlink w:history="1" r:id="rIdpkrciepgntdph6b4i2nft">
+      <w:hyperlink w:history="1" r:id="rIdmthdye2guhx1xtgwekv0h">
         <w:r>
           <w:rPr>
             <w:rFonts w:ascii="Arial" w:cs="Arial" w:eastAsia="Arial" w:hAnsi="Arial"/>
@@ -123,7 +123,7 @@
         </w:rPr>
         <w:t xml:space="preserve">Portfolio &amp; live demos: </w:t>
       </w:r>
-      <w:hyperlink w:history="1" r:id="rIdazva-gplm3fz5hoim2r5k">
+      <w:hyperlink w:history="1" r:id="rIdcoxviw43b33kazajc0svp">
         <w:r>
           <w:rPr>
             <w:rFonts w:ascii="Arial" w:cs="Arial" w:eastAsia="Arial" w:hAnsi="Arial"/>
@@ -371,83 +371,64 @@
           <w:sz w:val="18"/>
           <w:szCs w:val="18"/>
         </w:rPr>
-        <w:t xml:space="preserve">Lead discovery with small-practice owners (chiropractic, med spa), find where leads and revenue leak, and map business goals to CRM, automation, web, and AI voice solutions.</w:t>
-      </w:r>
-    </w:p>
-    <w:p>
-      <w:pPr>
-        <w:pStyle w:val="ListParagraph"/>
-        <w:numPr>
-          <w:ilvl w:val="0"/>
-          <w:numId w:val="2"/>
-        </w:numPr>
-        <w:spacing w:after="20"/>
-      </w:pPr>
-      <w:r>
-        <w:rPr>
-          <w:rFonts w:ascii="Arial" w:cs="Arial" w:eastAsia="Arial" w:hAnsi="Arial"/>
-          <w:color w:val="16181C"/>
-          <w:sz w:val="18"/>
-          <w:szCs w:val="18"/>
-        </w:rPr>
-        <w:t xml:space="preserve">Build proof-of-concept demos on each prospect's own brand: six live prospect demos and reference builds, including a revenue system with a live two-way AI receptionist line, test patient form, and 13-step patient journey.</w:t>
-      </w:r>
-    </w:p>
-    <w:p>
-      <w:pPr>
-        <w:pStyle w:val="ListParagraph"/>
-        <w:numPr>
-          <w:ilvl w:val="0"/>
-          <w:numId w:val="2"/>
-        </w:numPr>
-        <w:spacing w:after="20"/>
-      </w:pPr>
-      <w:r>
-        <w:rPr>
-          <w:rFonts w:ascii="Arial" w:cs="Arial" w:eastAsia="Arial" w:hAnsi="Arial"/>
-          <w:color w:val="16181C"/>
-          <w:sz w:val="18"/>
-          <w:szCs w:val="18"/>
-        </w:rPr>
-        <w:t xml:space="preserve">Design reusable solution architecture customized per client: a 12-stage CRM pipeline with tagged lead routing, missed-call text-back, 24-hour and 2-hour reminders, no-show recovery, review requests, and explicit follow-up stop conditions.</w:t>
-      </w:r>
-    </w:p>
-    <w:p>
-      <w:pPr>
-        <w:pStyle w:val="ListParagraph"/>
-        <w:numPr>
-          <w:ilvl w:val="0"/>
-          <w:numId w:val="2"/>
-        </w:numPr>
-        <w:spacing w:after="20"/>
-      </w:pPr>
-      <w:r>
-        <w:rPr>
-          <w:rFonts w:ascii="Arial" w:cs="Arial" w:eastAsia="Arial" w:hAnsi="Arial"/>
-          <w:color w:val="16181C"/>
-          <w:sz w:val="18"/>
-          <w:szCs w:val="18"/>
-        </w:rPr>
-        <w:t xml:space="preserve">Deliver public-information revenue-leak audits that separate verified findings from open questions, then present solution diagrams, scopes, proposals, and implementation plans with clear tradeoffs.</w:t>
-      </w:r>
-    </w:p>
-    <w:p>
-      <w:pPr>
-        <w:pStyle w:val="ListParagraph"/>
-        <w:numPr>
-          <w:ilvl w:val="0"/>
-          <w:numId w:val="2"/>
-        </w:numPr>
-        <w:spacing w:after="20"/>
-      </w:pPr>
-      <w:r>
-        <w:rPr>
-          <w:rFonts w:ascii="Arial" w:cs="Arial" w:eastAsia="Arial" w:hAnsi="Arial"/>
-          <w:color w:val="16181C"/>
-          <w:sz w:val="18"/>
-          <w:szCs w:val="18"/>
-        </w:rPr>
-        <w:t xml:space="preserve">Own handoff from solution design into configuration, testing, launch, training, troubleshooting, and post-launch optimization using GoHighLevel, Twilio voice/SMS, REST APIs, and webhooks.</w:t>
+        <w:t xml:space="preserve">Lead discovery and public-information revenue-leak audits for small practices (chiropractic, med spa), pinpoint where leads and revenue leak, and map goals to CRM, automation, web, and AI voice solutions.</w:t>
+      </w:r>
+    </w:p>
+    <w:p>
+      <w:pPr>
+        <w:pStyle w:val="ListParagraph"/>
+        <w:numPr>
+          <w:ilvl w:val="0"/>
+          <w:numId w:val="2"/>
+        </w:numPr>
+        <w:spacing w:after="20"/>
+      </w:pPr>
+      <w:r>
+        <w:rPr>
+          <w:rFonts w:ascii="Arial" w:cs="Arial" w:eastAsia="Arial" w:hAnsi="Arial"/>
+          <w:color w:val="16181C"/>
+          <w:sz w:val="18"/>
+          <w:szCs w:val="18"/>
+        </w:rPr>
+        <w:t xml:space="preserve">Build proof-of-concept demos on each prospect's own brand: six live prospect demos, including a revenue system with a live two-way AI receptionist line, test patient form, and 13-step patient journey.</w:t>
+      </w:r>
+    </w:p>
+    <w:p>
+      <w:pPr>
+        <w:pStyle w:val="ListParagraph"/>
+        <w:numPr>
+          <w:ilvl w:val="0"/>
+          <w:numId w:val="2"/>
+        </w:numPr>
+        <w:spacing w:after="20"/>
+      </w:pPr>
+      <w:r>
+        <w:rPr>
+          <w:rFonts w:ascii="Arial" w:cs="Arial" w:eastAsia="Arial" w:hAnsi="Arial"/>
+          <w:color w:val="16181C"/>
+          <w:sz w:val="18"/>
+          <w:szCs w:val="18"/>
+        </w:rPr>
+        <w:t xml:space="preserve">Design reusable solution architecture customized per client: a 12-stage CRM pipeline with tagged lead routing, missed-call text-back, 24-hour and 2-hour reminders, no-show recovery, and review requests.</w:t>
+      </w:r>
+    </w:p>
+    <w:p>
+      <w:pPr>
+        <w:pStyle w:val="ListParagraph"/>
+        <w:numPr>
+          <w:ilvl w:val="0"/>
+          <w:numId w:val="2"/>
+        </w:numPr>
+        <w:spacing w:after="20"/>
+      </w:pPr>
+      <w:r>
+        <w:rPr>
+          <w:rFonts w:ascii="Arial" w:cs="Arial" w:eastAsia="Arial" w:hAnsi="Arial"/>
+          <w:color w:val="16181C"/>
+          <w:sz w:val="18"/>
+          <w:szCs w:val="18"/>
+        </w:rPr>
+        <w:t xml:space="preserve">Present solution diagrams, scopes, and implementation plans with clear tradeoffs, then own handoff into configuration, testing, launch, and training using GoHighLevel, Twilio, REST APIs, and webhooks.</w:t>
       </w:r>
     </w:p>
     <w:p>
@@ -554,6 +535,25 @@
           <w:sz w:val="18"/>
           <w:szCs w:val="18"/>
         </w:rPr>
+        <w:t xml:space="preserve">Translated financing, product, and transaction details into clear recommendations and next steps toward purchase.</w:t>
+      </w:r>
+    </w:p>
+    <w:p>
+      <w:pPr>
+        <w:pStyle w:val="ListParagraph"/>
+        <w:numPr>
+          <w:ilvl w:val="0"/>
+          <w:numId w:val="2"/>
+        </w:numPr>
+        <w:spacing w:after="20"/>
+      </w:pPr>
+      <w:r>
+        <w:rPr>
+          <w:rFonts w:ascii="Arial" w:cs="Arial" w:eastAsia="Arial" w:hAnsi="Arial"/>
+          <w:color w:val="16181C"/>
+          <w:sz w:val="18"/>
+          <w:szCs w:val="18"/>
+        </w:rPr>
         <w:t xml:space="preserve">Maintained accurate CRM and case documentation across high transaction volume and compliance-sensitive information.</w:t>
       </w:r>
     </w:p>
@@ -666,6 +666,25 @@
     </w:p>
     <w:p>
       <w:pPr>
+        <w:pStyle w:val="ListParagraph"/>
+        <w:numPr>
+          <w:ilvl w:val="0"/>
+          <w:numId w:val="2"/>
+        </w:numPr>
+        <w:spacing w:after="20"/>
+      </w:pPr>
+      <w:r>
+        <w:rPr>
+          <w:rFonts w:ascii="Arial" w:cs="Arial" w:eastAsia="Arial" w:hAnsi="Arial"/>
+          <w:color w:val="16181C"/>
+          <w:sz w:val="18"/>
+          <w:szCs w:val="18"/>
+        </w:rPr>
+        <w:t xml:space="preserve">Balanced revenue goals, customer satisfaction, and documentation accuracy across complex multi-step transactions.</w:t>
+      </w:r>
+    </w:p>
+    <w:p>
+      <w:pPr>
         <w:pBdr>
           <w:bottom w:val="single" w:color="C9C8C2" w:sz="4" w:space="2"/>
         </w:pBdr>
@@ -710,7 +729,7 @@
         </w:rPr>
         <w:t xml:space="preserve">	</w:t>
       </w:r>
-      <w:hyperlink w:history="1" r:id="rIdxl-oovjry0xhcokb8j74-">
+      <w:hyperlink w:history="1" r:id="rIdchjwjwmy9iqataztvm0t0">
         <w:r>
           <w:rPr>
             <w:rFonts w:ascii="Arial" w:cs="Arial" w:eastAsia="Arial" w:hAnsi="Arial"/>

</xml_diff>

<commit_message>
Add free browser-based AI receptionist; retire GHL phone demo line
- /receptionist: Web Speech API in/out + Gemini replies via
  /api/receptionist (guarded prompt, capped history, rate limit,
  graceful offline state until GEMINI_API_KEY is set)
- Demo mode (?demo=1) plays a fictional practice front desk
- Cactus demo copy: call-the-number CTA now opens the browser
  receptionist; portfolio, résumé and LinkedIn copy no longer
  depend on the 860 line
- Permissions-Policy allows same-origin microphone

Co-Authored-By: Claude Opus 5.5 <noreply@anthropic.com>
</commit_message>
<xml_diff>
--- a/public/Emmanuel_Nanadoum_Solutions_Engineer_Resume.docx
+++ b/public/Emmanuel_Nanadoum_Solutions_Engineer_Resume.docx
@@ -53,7 +53,7 @@
         </w:rPr>
         <w:t xml:space="preserve"> | </w:t>
       </w:r>
-      <w:hyperlink w:history="1" r:id="rIdrj2o4s6cqjmpec9yaiyac">
+      <w:hyperlink w:history="1" r:id="rIdtwzdf7oy8rzjisant2e1n">
         <w:r>
           <w:rPr>
             <w:rFonts w:ascii="Arial" w:cs="Arial" w:eastAsia="Arial" w:hAnsi="Arial"/>
@@ -73,7 +73,7 @@
         </w:rPr>
         <w:t xml:space="preserve"> | </w:t>
       </w:r>
-      <w:hyperlink w:history="1" r:id="rId2rr1edpvukopsbpjw5iv5">
+      <w:hyperlink w:history="1" r:id="rIdiyn9jumz2lct1zibm9o2w">
         <w:r>
           <w:rPr>
             <w:rFonts w:ascii="Arial" w:cs="Arial" w:eastAsia="Arial" w:hAnsi="Arial"/>
@@ -93,7 +93,7 @@
         </w:rPr>
         <w:t xml:space="preserve"> | </w:t>
       </w:r>
-      <w:hyperlink w:history="1" r:id="rIdmthdye2guhx1xtgwekv0h">
+      <w:hyperlink w:history="1" r:id="rIdbzs9mbzlj46u_b1gk_42u">
         <w:r>
           <w:rPr>
             <w:rFonts w:ascii="Arial" w:cs="Arial" w:eastAsia="Arial" w:hAnsi="Arial"/>
@@ -123,7 +123,7 @@
         </w:rPr>
         <w:t xml:space="preserve">Portfolio &amp; live demos: </w:t>
       </w:r>
-      <w:hyperlink w:history="1" r:id="rIdcoxviw43b33kazajc0svp">
+      <w:hyperlink w:history="1" r:id="rId6dgyxifxw36tanfxjp0eq">
         <w:r>
           <w:rPr>
             <w:rFonts w:ascii="Arial" w:cs="Arial" w:eastAsia="Arial" w:hAnsi="Arial"/>
@@ -390,7 +390,7 @@
           <w:sz w:val="18"/>
           <w:szCs w:val="18"/>
         </w:rPr>
-        <w:t xml:space="preserve">Build proof-of-concept demos on each prospect's own brand: six live prospect demos, including a revenue system with a live two-way AI receptionist line, test patient form, and 13-step patient journey.</w:t>
+        <w:t xml:space="preserve">Build proof-of-concept demos on each prospect's own brand: six live prospect demos, including a revenue system with a live AI voice receptionist, test patient form, and 13-step patient journey.</w:t>
       </w:r>
     </w:p>
     <w:p>
@@ -729,7 +729,7 @@
         </w:rPr>
         <w:t xml:space="preserve">	</w:t>
       </w:r>
-      <w:hyperlink w:history="1" r:id="rIdchjwjwmy9iqataztvm0t0">
+      <w:hyperlink w:history="1" r:id="rIdoyaxsqsxzrtlsrnezgfvt">
         <w:r>
           <w:rPr>
             <w:rFonts w:ascii="Arial" w:cs="Arial" w:eastAsia="Arial" w:hAnsi="Arial"/>

</xml_diff>

<commit_message>
Résumé and site: drop 3-month DriveTime stint; add AI receptionist project
Blair (2020-present) covers the period, so there is no gap. The freed
space lists the live browser AI receptionist (Gemini + Web Speech API).

Co-Authored-By: Claude Opus 5.5 <noreply@anthropic.com>
</commit_message>
<xml_diff>
--- a/public/Emmanuel_Nanadoum_Solutions_Engineer_Resume.docx
+++ b/public/Emmanuel_Nanadoum_Solutions_Engineer_Resume.docx
@@ -53,7 +53,7 @@
         </w:rPr>
         <w:t xml:space="preserve"> | </w:t>
       </w:r>
-      <w:hyperlink w:history="1" r:id="rIdtwzdf7oy8rzjisant2e1n">
+      <w:hyperlink w:history="1" r:id="rIdufmv2gxee8ezkyflwq_mx">
         <w:r>
           <w:rPr>
             <w:rFonts w:ascii="Arial" w:cs="Arial" w:eastAsia="Arial" w:hAnsi="Arial"/>
@@ -73,7 +73,7 @@
         </w:rPr>
         <w:t xml:space="preserve"> | </w:t>
       </w:r>
-      <w:hyperlink w:history="1" r:id="rIdiyn9jumz2lct1zibm9o2w">
+      <w:hyperlink w:history="1" r:id="rIdgrqz5-5kxs4vhqtxhar_b">
         <w:r>
           <w:rPr>
             <w:rFonts w:ascii="Arial" w:cs="Arial" w:eastAsia="Arial" w:hAnsi="Arial"/>
@@ -93,7 +93,7 @@
         </w:rPr>
         <w:t xml:space="preserve"> | </w:t>
       </w:r>
-      <w:hyperlink w:history="1" r:id="rIdbzs9mbzlj46u_b1gk_42u">
+      <w:hyperlink w:history="1" r:id="rId2qwg2b6gh9euyfdrdiw3c">
         <w:r>
           <w:rPr>
             <w:rFonts w:ascii="Arial" w:cs="Arial" w:eastAsia="Arial" w:hAnsi="Arial"/>
@@ -123,7 +123,7 @@
         </w:rPr>
         <w:t xml:space="preserve">Portfolio &amp; live demos: </w:t>
       </w:r>
-      <w:hyperlink w:history="1" r:id="rId6dgyxifxw36tanfxjp0eq">
+      <w:hyperlink w:history="1" r:id="rIdg6nuqm6nczlp2l2y96pmp">
         <w:r>
           <w:rPr>
             <w:rFonts w:ascii="Arial" w:cs="Arial" w:eastAsia="Arial" w:hAnsi="Arial"/>
@@ -283,7 +283,7 @@
           <w:sz w:val="18"/>
           <w:szCs w:val="18"/>
         </w:rPr>
-        <w:t xml:space="preserve">GoHighLevel, HubSpot, Salesforce, Twilio (voice/SMS), ElevenLabs (speech-to-text, text-to-speech), AI voice agents, CRM automation, Jira</w:t>
+        <w:t xml:space="preserve">GoHighLevel, HubSpot, Salesforce, Twilio (voice/SMS), ElevenLabs (speech-to-text, text-to-speech), Google Gemini API, Web Speech API, AI voice agents, CRM automation, Jira</w:t>
       </w:r>
     </w:p>
     <w:p>
@@ -447,7 +447,7 @@
           <w:sz w:val="20"/>
           <w:szCs w:val="20"/>
         </w:rPr>
-        <w:t xml:space="preserve">Online Experience Advisor</w:t>
+        <w:t xml:space="preserve">Sales Representative</w:t>
       </w:r>
       <w:r>
         <w:rPr>
@@ -467,7 +467,7 @@
           <w:sz w:val="18"/>
           <w:szCs w:val="18"/>
         </w:rPr>
-        <w:t xml:space="preserve">Jul 2026 – Sep 2026</w:t>
+        <w:t xml:space="preserve">Sep 2017 – 2025</w:t>
       </w:r>
     </w:p>
     <w:p>
@@ -478,7 +478,7 @@
           <w:sz w:val="18"/>
           <w:szCs w:val="18"/>
         </w:rPr>
-        <w:t xml:space="preserve">DriveTime | Tempe, AZ</w:t>
+        <w:t xml:space="preserve">A Better Way Wholesale Autos | Naugatuck, CT</w:t>
       </w:r>
     </w:p>
     <w:p>
@@ -497,7 +497,7 @@
           <w:sz w:val="18"/>
           <w:szCs w:val="18"/>
         </w:rPr>
-        <w:t xml:space="preserve">Guided customers through complex digital vehicle, financing, and documentation workflows using consultative discovery.</w:t>
+        <w:t xml:space="preserve">Managed a high-volume, high-ticket pipeline from discovery through close, matching needs to vehicle and financing options.</w:t>
       </w:r>
     </w:p>
     <w:p>
@@ -516,7 +516,7 @@
           <w:sz w:val="18"/>
           <w:szCs w:val="18"/>
         </w:rPr>
-        <w:t xml:space="preserve">Resolved objections and account issues, and coordinated escalations when technical or operational support was needed.</w:t>
+        <w:t xml:space="preserve">Delivered product presentations, handled objections, and coordinated finance, service, and operations to close deals.</w:t>
       </w:r>
     </w:p>
     <w:p>
@@ -535,7 +535,7 @@
           <w:sz w:val="18"/>
           <w:szCs w:val="18"/>
         </w:rPr>
-        <w:t xml:space="preserve">Translated financing, product, and transaction details into clear recommendations and next steps toward purchase.</w:t>
+        <w:t xml:space="preserve">Built repeat and referral business through CRM follow-up and structured outreach; consistently a top performer.</w:t>
       </w:r>
     </w:p>
     <w:p>
@@ -554,7 +554,26 @@
           <w:sz w:val="18"/>
           <w:szCs w:val="18"/>
         </w:rPr>
-        <w:t xml:space="preserve">Maintained accurate CRM and case documentation across high transaction volume and compliance-sensitive information.</w:t>
+        <w:t xml:space="preserve">Balanced revenue goals, customer satisfaction, and documentation accuracy across complex multi-step transactions.</w:t>
+      </w:r>
+    </w:p>
+    <w:p>
+      <w:pPr>
+        <w:pBdr>
+          <w:bottom w:val="single" w:color="C9C8C2" w:sz="4" w:space="2"/>
+        </w:pBdr>
+        <w:spacing w:after="60" w:before="170"/>
+      </w:pPr>
+      <w:r>
+        <w:rPr>
+          <w:rFonts w:ascii="Arial" w:cs="Arial" w:eastAsia="Arial" w:hAnsi="Arial"/>
+          <w:b/>
+          <w:bCs/>
+          <w:color w:val="1D3FCF"/>
+          <w:sz w:val="19"/>
+          <w:szCs w:val="19"/>
+        </w:rPr>
+        <w:t xml:space="preserve">PROJECTS</w:t>
       </w:r>
     </w:p>
     <w:p>
@@ -573,7 +592,7 @@
           <w:sz w:val="20"/>
           <w:szCs w:val="20"/>
         </w:rPr>
-        <w:t xml:space="preserve">Sales Representative</w:t>
+        <w:t xml:space="preserve">VYBE, AI passenger experience platform</w:t>
       </w:r>
       <w:r>
         <w:rPr>
@@ -584,152 +603,7 @@
         </w:rPr>
         <w:t xml:space="preserve">	</w:t>
       </w:r>
-      <w:r>
-        <w:rPr>
-          <w:rFonts w:ascii="Arial" w:cs="Arial" w:eastAsia="Arial" w:hAnsi="Arial"/>
-          <w:b/>
-          <w:bCs/>
-          <w:color w:val="16181C"/>
-          <w:sz w:val="18"/>
-          <w:szCs w:val="18"/>
-        </w:rPr>
-        <w:t xml:space="preserve">Sep 2017 – 2025</w:t>
-      </w:r>
-    </w:p>
-    <w:p>
-      <w:r>
-        <w:rPr>
-          <w:rFonts w:ascii="Arial" w:cs="Arial" w:eastAsia="Arial" w:hAnsi="Arial"/>
-          <w:color w:val="3D4047"/>
-          <w:sz w:val="18"/>
-          <w:szCs w:val="18"/>
-        </w:rPr>
-        <w:t xml:space="preserve">A Better Way Wholesale Autos | Naugatuck, CT</w:t>
-      </w:r>
-    </w:p>
-    <w:p>
-      <w:pPr>
-        <w:pStyle w:val="ListParagraph"/>
-        <w:numPr>
-          <w:ilvl w:val="0"/>
-          <w:numId w:val="2"/>
-        </w:numPr>
-        <w:spacing w:after="20"/>
-      </w:pPr>
-      <w:r>
-        <w:rPr>
-          <w:rFonts w:ascii="Arial" w:cs="Arial" w:eastAsia="Arial" w:hAnsi="Arial"/>
-          <w:color w:val="16181C"/>
-          <w:sz w:val="18"/>
-          <w:szCs w:val="18"/>
-        </w:rPr>
-        <w:t xml:space="preserve">Managed a high-volume, high-ticket pipeline from discovery through close, matching needs to vehicle and financing options.</w:t>
-      </w:r>
-    </w:p>
-    <w:p>
-      <w:pPr>
-        <w:pStyle w:val="ListParagraph"/>
-        <w:numPr>
-          <w:ilvl w:val="0"/>
-          <w:numId w:val="2"/>
-        </w:numPr>
-        <w:spacing w:after="20"/>
-      </w:pPr>
-      <w:r>
-        <w:rPr>
-          <w:rFonts w:ascii="Arial" w:cs="Arial" w:eastAsia="Arial" w:hAnsi="Arial"/>
-          <w:color w:val="16181C"/>
-          <w:sz w:val="18"/>
-          <w:szCs w:val="18"/>
-        </w:rPr>
-        <w:t xml:space="preserve">Delivered product presentations, handled objections, and coordinated finance, service, and operations to close deals.</w:t>
-      </w:r>
-    </w:p>
-    <w:p>
-      <w:pPr>
-        <w:pStyle w:val="ListParagraph"/>
-        <w:numPr>
-          <w:ilvl w:val="0"/>
-          <w:numId w:val="2"/>
-        </w:numPr>
-        <w:spacing w:after="20"/>
-      </w:pPr>
-      <w:r>
-        <w:rPr>
-          <w:rFonts w:ascii="Arial" w:cs="Arial" w:eastAsia="Arial" w:hAnsi="Arial"/>
-          <w:color w:val="16181C"/>
-          <w:sz w:val="18"/>
-          <w:szCs w:val="18"/>
-        </w:rPr>
-        <w:t xml:space="preserve">Built repeat and referral business through CRM follow-up and structured outreach; consistently a top performer.</w:t>
-      </w:r>
-    </w:p>
-    <w:p>
-      <w:pPr>
-        <w:pStyle w:val="ListParagraph"/>
-        <w:numPr>
-          <w:ilvl w:val="0"/>
-          <w:numId w:val="2"/>
-        </w:numPr>
-        <w:spacing w:after="20"/>
-      </w:pPr>
-      <w:r>
-        <w:rPr>
-          <w:rFonts w:ascii="Arial" w:cs="Arial" w:eastAsia="Arial" w:hAnsi="Arial"/>
-          <w:color w:val="16181C"/>
-          <w:sz w:val="18"/>
-          <w:szCs w:val="18"/>
-        </w:rPr>
-        <w:t xml:space="preserve">Balanced revenue goals, customer satisfaction, and documentation accuracy across complex multi-step transactions.</w:t>
-      </w:r>
-    </w:p>
-    <w:p>
-      <w:pPr>
-        <w:pBdr>
-          <w:bottom w:val="single" w:color="C9C8C2" w:sz="4" w:space="2"/>
-        </w:pBdr>
-        <w:spacing w:after="60" w:before="170"/>
-      </w:pPr>
-      <w:r>
-        <w:rPr>
-          <w:rFonts w:ascii="Arial" w:cs="Arial" w:eastAsia="Arial" w:hAnsi="Arial"/>
-          <w:b/>
-          <w:bCs/>
-          <w:color w:val="1D3FCF"/>
-          <w:sz w:val="19"/>
-          <w:szCs w:val="19"/>
-        </w:rPr>
-        <w:t xml:space="preserve">PROJECTS</w:t>
-      </w:r>
-    </w:p>
-    <w:p>
-      <w:pPr>
-        <w:tabs>
-          <w:tab w:val="right" w:pos="10800"/>
-        </w:tabs>
-        <w:spacing w:before="90"/>
-      </w:pPr>
-      <w:r>
-        <w:rPr>
-          <w:rFonts w:ascii="Arial" w:cs="Arial" w:eastAsia="Arial" w:hAnsi="Arial"/>
-          <w:b/>
-          <w:bCs/>
-          <w:color w:val="16181C"/>
-          <w:sz w:val="20"/>
-          <w:szCs w:val="20"/>
-        </w:rPr>
-        <w:t xml:space="preserve">VYBE, AI passenger experience platform</w:t>
-      </w:r>
-      <w:r>
-        <w:rPr>
-          <w:rFonts w:ascii="Arial" w:cs="Arial" w:eastAsia="Arial" w:hAnsi="Arial"/>
-          <w:color w:val="16181C"/>
-          <w:sz w:val="18"/>
-          <w:szCs w:val="18"/>
-        </w:rPr>
-        <w:t xml:space="preserve">	</w:t>
-      </w:r>
-      <w:hyperlink w:history="1" r:id="rIdoyaxsqsxzrtlsrnezgfvt">
+      <w:hyperlink w:history="1" r:id="rIdnbrfiepft9xuzevouic4o">
         <w:r>
           <w:rPr>
             <w:rFonts w:ascii="Arial" w:cs="Arial" w:eastAsia="Arial" w:hAnsi="Arial"/>
@@ -779,6 +653,85 @@
           <w:szCs w:val="18"/>
         </w:rPr>
         <w:t xml:space="preserve">Supabase for auth, shared rides, and saved setups; provider keys kept server-side; Google Places/Routes recommendations integrated behind production credentials.</w:t>
+      </w:r>
+    </w:p>
+    <w:p>
+      <w:pPr>
+        <w:tabs>
+          <w:tab w:val="right" w:pos="10800"/>
+        </w:tabs>
+        <w:spacing w:before="90"/>
+      </w:pPr>
+      <w:r>
+        <w:rPr>
+          <w:rFonts w:ascii="Arial" w:cs="Arial" w:eastAsia="Arial" w:hAnsi="Arial"/>
+          <w:b/>
+          <w:bCs/>
+          <w:color w:val="16181C"/>
+          <w:sz w:val="20"/>
+          <w:szCs w:val="20"/>
+        </w:rPr>
+        <w:t xml:space="preserve">AI voice receptionist, browser voice agent</w:t>
+      </w:r>
+      <w:r>
+        <w:rPr>
+          <w:rFonts w:ascii="Arial" w:cs="Arial" w:eastAsia="Arial" w:hAnsi="Arial"/>
+          <w:color w:val="16181C"/>
+          <w:sz w:val="18"/>
+          <w:szCs w:val="18"/>
+        </w:rPr>
+        <w:t xml:space="preserve">	</w:t>
+      </w:r>
+      <w:hyperlink w:history="1" r:id="rIdcohvcgdtilozo2ax3opcu">
+        <w:r>
+          <w:rPr>
+            <w:rFonts w:ascii="Arial" w:cs="Arial" w:eastAsia="Arial" w:hAnsi="Arial"/>
+            <w:b/>
+            <w:bCs/>
+            <w:color w:val="16181C"/>
+            <w:sz w:val="18"/>
+            <w:szCs w:val="18"/>
+          </w:rPr>
+          <w:t xml:space="preserve">emmanuel-nanadoum.vercel.app/receptionist</w:t>
+        </w:r>
+      </w:hyperlink>
+    </w:p>
+    <w:p>
+      <w:pPr>
+        <w:pStyle w:val="ListParagraph"/>
+        <w:numPr>
+          <w:ilvl w:val="0"/>
+          <w:numId w:val="2"/>
+        </w:numPr>
+        <w:spacing w:after="20"/>
+      </w:pPr>
+      <w:r>
+        <w:rPr>
+          <w:rFonts w:ascii="Arial" w:cs="Arial" w:eastAsia="Arial" w:hAnsi="Arial"/>
+          <w:color w:val="16181C"/>
+          <w:sz w:val="18"/>
+          <w:szCs w:val="18"/>
+        </w:rPr>
+        <w:t xml:space="preserve">Built a two-way voice receptionist that runs in the browser: Web Speech API for listening and speaking, Google Gemini for replies, plus a demo mode that runs a sample practice's front desk.</w:t>
+      </w:r>
+    </w:p>
+    <w:p>
+      <w:pPr>
+        <w:pStyle w:val="ListParagraph"/>
+        <w:numPr>
+          <w:ilvl w:val="0"/>
+          <w:numId w:val="2"/>
+        </w:numPr>
+        <w:spacing w:after="20"/>
+      </w:pPr>
+      <w:r>
+        <w:rPr>
+          <w:rFonts w:ascii="Arial" w:cs="Arial" w:eastAsia="Arial" w:hAnsi="Arial"/>
+          <w:color w:val="16181C"/>
+          <w:sz w:val="18"/>
+          <w:szCs w:val="18"/>
+        </w:rPr>
+        <w:t xml:space="preserve">Guardrails in the system prompt (discloses it is AI; no prices, results, or medical advice; never claims a booking), per-IP rate limiting, and automatic fallback across Gemini models.</w:t>
       </w:r>
     </w:p>
     <w:p>

</xml_diff>

<commit_message>
Résumé and site: add Family First Life customer success role
Experience is now Blair Digital Studios, A Better Way Wholesale Autos
and Family First Life, newest first by end date. Summary adds customer
success and renewals; project bullets tightened to keep one page.

Co-Authored-By: Claude Opus 5.5 <noreply@anthropic.com>
</commit_message>
<xml_diff>
--- a/public/Emmanuel_Nanadoum_Solutions_Engineer_Resume.docx
+++ b/public/Emmanuel_Nanadoum_Solutions_Engineer_Resume.docx
@@ -53,7 +53,7 @@
         </w:rPr>
         <w:t xml:space="preserve"> | </w:t>
       </w:r>
-      <w:hyperlink w:history="1" r:id="rIdufmv2gxee8ezkyflwq_mx">
+      <w:hyperlink w:history="1" r:id="rIdzz_waef6hkxlx0ymsgaqn">
         <w:r>
           <w:rPr>
             <w:rFonts w:ascii="Arial" w:cs="Arial" w:eastAsia="Arial" w:hAnsi="Arial"/>
@@ -73,7 +73,7 @@
         </w:rPr>
         <w:t xml:space="preserve"> | </w:t>
       </w:r>
-      <w:hyperlink w:history="1" r:id="rIdgrqz5-5kxs4vhqtxhar_b">
+      <w:hyperlink w:history="1" r:id="rIdnfcq8topps2jmlrjdoz5k">
         <w:r>
           <w:rPr>
             <w:rFonts w:ascii="Arial" w:cs="Arial" w:eastAsia="Arial" w:hAnsi="Arial"/>
@@ -93,7 +93,7 @@
         </w:rPr>
         <w:t xml:space="preserve"> | </w:t>
       </w:r>
-      <w:hyperlink w:history="1" r:id="rId2qwg2b6gh9euyfdrdiw3c">
+      <w:hyperlink w:history="1" r:id="rIdekwybkjbd0fgwnqh_6aa5">
         <w:r>
           <w:rPr>
             <w:rFonts w:ascii="Arial" w:cs="Arial" w:eastAsia="Arial" w:hAnsi="Arial"/>
@@ -123,7 +123,7 @@
         </w:rPr>
         <w:t xml:space="preserve">Portfolio &amp; live demos: </w:t>
       </w:r>
-      <w:hyperlink w:history="1" r:id="rIdg6nuqm6nczlp2l2y96pmp">
+      <w:hyperlink w:history="1" r:id="rIdpkieuayfavvtr34cdknzc">
         <w:r>
           <w:rPr>
             <w:rFonts w:ascii="Arial" w:cs="Arial" w:eastAsia="Arial" w:hAnsi="Arial"/>
@@ -164,7 +164,7 @@
           <w:sz w:val="18"/>
           <w:szCs w:val="18"/>
         </w:rPr>
-        <w:t xml:space="preserve">Customer-facing technical and sales professional with 8+ years of consultative, high-ticket selling and 4+ years designing CRM, automation, web, and AI voice solutions. Leads discovery, turns business pain into technical requirements, builds proof-of-concept demos on the prospect's own business, and guides customers from evaluation through implementation. Portfolio: six live prospect demos and a deployed AI voice product.</w:t>
+        <w:t xml:space="preserve">Customer-facing technical and sales professional with 8+ years of consultative, high-ticket selling, customer success experience, and 4+ years designing CRM, automation, web, and AI voice solutions. Leads discovery, turns business pain into technical requirements, builds proof-of-concept demos on the prospect's own business, and guides customers from evaluation through implementation, onboarding, and renewal. Portfolio: six live prospect demos and two deployed AI voice products.</w:t>
       </w:r>
     </w:p>
     <w:p>
@@ -559,6 +559,132 @@
     </w:p>
     <w:p>
       <w:pPr>
+        <w:tabs>
+          <w:tab w:val="right" w:pos="10800"/>
+        </w:tabs>
+        <w:spacing w:before="90"/>
+      </w:pPr>
+      <w:r>
+        <w:rPr>
+          <w:rFonts w:ascii="Arial" w:cs="Arial" w:eastAsia="Arial" w:hAnsi="Arial"/>
+          <w:b/>
+          <w:bCs/>
+          <w:color w:val="16181C"/>
+          <w:sz w:val="20"/>
+          <w:szCs w:val="20"/>
+        </w:rPr>
+        <w:t xml:space="preserve">Customer Success Specialist</w:t>
+      </w:r>
+      <w:r>
+        <w:rPr>
+          <w:rFonts w:ascii="Arial" w:cs="Arial" w:eastAsia="Arial" w:hAnsi="Arial"/>
+          <w:color w:val="16181C"/>
+          <w:sz w:val="18"/>
+          <w:szCs w:val="18"/>
+        </w:rPr>
+        <w:t xml:space="preserve">	</w:t>
+      </w:r>
+      <w:r>
+        <w:rPr>
+          <w:rFonts w:ascii="Arial" w:cs="Arial" w:eastAsia="Arial" w:hAnsi="Arial"/>
+          <w:b/>
+          <w:bCs/>
+          <w:color w:val="16181C"/>
+          <w:sz w:val="18"/>
+          <w:szCs w:val="18"/>
+        </w:rPr>
+        <w:t xml:space="preserve">Jan 2023 – Jan 2024</w:t>
+      </w:r>
+    </w:p>
+    <w:p>
+      <w:r>
+        <w:rPr>
+          <w:rFonts w:ascii="Arial" w:cs="Arial" w:eastAsia="Arial" w:hAnsi="Arial"/>
+          <w:color w:val="3D4047"/>
+          <w:sz w:val="18"/>
+          <w:szCs w:val="18"/>
+        </w:rPr>
+        <w:t xml:space="preserve">Family First Life | Manchester, CT (Remote)</w:t>
+      </w:r>
+    </w:p>
+    <w:p>
+      <w:pPr>
+        <w:pStyle w:val="ListParagraph"/>
+        <w:numPr>
+          <w:ilvl w:val="0"/>
+          <w:numId w:val="2"/>
+        </w:numPr>
+        <w:spacing w:after="20"/>
+      </w:pPr>
+      <w:r>
+        <w:rPr>
+          <w:rFonts w:ascii="Arial" w:cs="Arial" w:eastAsia="Arial" w:hAnsi="Arial"/>
+          <w:color w:val="16181C"/>
+          <w:sz w:val="18"/>
+          <w:szCs w:val="18"/>
+        </w:rPr>
+        <w:t xml:space="preserve">Onboarded and educated 15–20 new customers a month, turning complex product options into clear recommendations.</w:t>
+      </w:r>
+    </w:p>
+    <w:p>
+      <w:pPr>
+        <w:pStyle w:val="ListParagraph"/>
+        <w:numPr>
+          <w:ilvl w:val="0"/>
+          <w:numId w:val="2"/>
+        </w:numPr>
+        <w:spacing w:after="20"/>
+      </w:pPr>
+      <w:r>
+        <w:rPr>
+          <w:rFonts w:ascii="Arial" w:cs="Arial" w:eastAsia="Arial" w:hAnsi="Arial"/>
+          <w:color w:val="16181C"/>
+          <w:sz w:val="18"/>
+          <w:szCs w:val="18"/>
+        </w:rPr>
+        <w:t xml:space="preserve">Owned renewal conversations, using consultative discovery to reconfirm each customer's goals and the value of their plan.</w:t>
+      </w:r>
+    </w:p>
+    <w:p>
+      <w:pPr>
+        <w:pStyle w:val="ListParagraph"/>
+        <w:numPr>
+          <w:ilvl w:val="0"/>
+          <w:numId w:val="2"/>
+        </w:numPr>
+        <w:spacing w:after="20"/>
+      </w:pPr>
+      <w:r>
+        <w:rPr>
+          <w:rFonts w:ascii="Arial" w:cs="Arial" w:eastAsia="Arial" w:hAnsi="Arial"/>
+          <w:color w:val="16181C"/>
+          <w:sz w:val="18"/>
+          <w:szCs w:val="18"/>
+        </w:rPr>
+        <w:t xml:space="preserve">Resolved concerns and objections through consistent follow-up, clear expectations, and value-based communication.</w:t>
+      </w:r>
+    </w:p>
+    <w:p>
+      <w:pPr>
+        <w:pStyle w:val="ListParagraph"/>
+        <w:numPr>
+          <w:ilvl w:val="0"/>
+          <w:numId w:val="2"/>
+        </w:numPr>
+        <w:spacing w:after="20"/>
+      </w:pPr>
+      <w:r>
+        <w:rPr>
+          <w:rFonts w:ascii="Arial" w:cs="Arial" w:eastAsia="Arial" w:hAnsi="Arial"/>
+          <w:color w:val="16181C"/>
+          <w:sz w:val="18"/>
+          <w:szCs w:val="18"/>
+        </w:rPr>
+        <w:t xml:space="preserve">Worked within a regulated, compliance-sensitive process, handling customer information and records accurately.</w:t>
+      </w:r>
+    </w:p>
+    <w:p>
+      <w:pPr>
         <w:pBdr>
           <w:bottom w:val="single" w:color="C9C8C2" w:sz="4" w:space="2"/>
         </w:pBdr>
@@ -603,7 +729,7 @@
         </w:rPr>
         <w:t xml:space="preserve">	</w:t>
       </w:r>
-      <w:hyperlink w:history="1" r:id="rIdnbrfiepft9xuzevouic4o">
+      <w:hyperlink w:history="1" r:id="rIds3xxk-iri0gv18ktrfdmc">
         <w:r>
           <w:rPr>
             <w:rFonts w:ascii="Arial" w:cs="Arial" w:eastAsia="Arial" w:hAnsi="Arial"/>
@@ -633,26 +759,26 @@
           <w:sz w:val="18"/>
           <w:szCs w:val="18"/>
         </w:rPr>
-        <w:t xml:space="preserve">Designed and deployed a voice concierge that keeps ride context (destination, trip length, passengers, mood): browser audio → ElevenLabs Scribe → context-aware response → ElevenLabs speech, on Vercel serverless functions.</w:t>
-      </w:r>
-    </w:p>
-    <w:p>
-      <w:pPr>
-        <w:pStyle w:val="ListParagraph"/>
-        <w:numPr>
-          <w:ilvl w:val="0"/>
-          <w:numId w:val="2"/>
-        </w:numPr>
-        <w:spacing w:after="20"/>
-      </w:pPr>
-      <w:r>
-        <w:rPr>
-          <w:rFonts w:ascii="Arial" w:cs="Arial" w:eastAsia="Arial" w:hAnsi="Arial"/>
-          <w:color w:val="16181C"/>
-          <w:sz w:val="18"/>
-          <w:szCs w:val="18"/>
-        </w:rPr>
-        <w:t xml:space="preserve">Supabase for auth, shared rides, and saved setups; provider keys kept server-side; Google Places/Routes recommendations integrated behind production credentials.</w:t>
+        <w:t xml:space="preserve">Deployed a context-aware voice concierge: browser audio → ElevenLabs Scribe → ride-context reply → ElevenLabs speech.</w:t>
+      </w:r>
+    </w:p>
+    <w:p>
+      <w:pPr>
+        <w:pStyle w:val="ListParagraph"/>
+        <w:numPr>
+          <w:ilvl w:val="0"/>
+          <w:numId w:val="2"/>
+        </w:numPr>
+        <w:spacing w:after="20"/>
+      </w:pPr>
+      <w:r>
+        <w:rPr>
+          <w:rFonts w:ascii="Arial" w:cs="Arial" w:eastAsia="Arial" w:hAnsi="Arial"/>
+          <w:color w:val="16181C"/>
+          <w:sz w:val="18"/>
+          <w:szCs w:val="18"/>
+        </w:rPr>
+        <w:t xml:space="preserve">Supabase auth and shared rides; keys kept server-side; Google Places/Routes behind production credentials.</w:t>
       </w:r>
     </w:p>
     <w:p>
@@ -682,7 +808,7 @@
         </w:rPr>
         <w:t xml:space="preserve">	</w:t>
       </w:r>
-      <w:hyperlink w:history="1" r:id="rIdcohvcgdtilozo2ax3opcu">
+      <w:hyperlink w:history="1" r:id="rId1jb_f4xj6ckbhwtvse6cm">
         <w:r>
           <w:rPr>
             <w:rFonts w:ascii="Arial" w:cs="Arial" w:eastAsia="Arial" w:hAnsi="Arial"/>
@@ -712,26 +838,26 @@
           <w:sz w:val="18"/>
           <w:szCs w:val="18"/>
         </w:rPr>
-        <w:t xml:space="preserve">Built a two-way voice receptionist that runs in the browser: Web Speech API for listening and speaking, Google Gemini for replies, plus a demo mode that runs a sample practice's front desk.</w:t>
-      </w:r>
-    </w:p>
-    <w:p>
-      <w:pPr>
-        <w:pStyle w:val="ListParagraph"/>
-        <w:numPr>
-          <w:ilvl w:val="0"/>
-          <w:numId w:val="2"/>
-        </w:numPr>
-        <w:spacing w:after="20"/>
-      </w:pPr>
-      <w:r>
-        <w:rPr>
-          <w:rFonts w:ascii="Arial" w:cs="Arial" w:eastAsia="Arial" w:hAnsi="Arial"/>
-          <w:color w:val="16181C"/>
-          <w:sz w:val="18"/>
-          <w:szCs w:val="18"/>
-        </w:rPr>
-        <w:t xml:space="preserve">Guardrails in the system prompt (discloses it is AI; no prices, results, or medical advice; never claims a booking), per-IP rate limiting, and automatic fallback across Gemini models.</w:t>
+        <w:t xml:space="preserve">Two-way browser voice agent: Web Speech API in and out, Google Gemini replies, sample front-desk demo mode.</w:t>
+      </w:r>
+    </w:p>
+    <w:p>
+      <w:pPr>
+        <w:pStyle w:val="ListParagraph"/>
+        <w:numPr>
+          <w:ilvl w:val="0"/>
+          <w:numId w:val="2"/>
+        </w:numPr>
+        <w:spacing w:after="20"/>
+      </w:pPr>
+      <w:r>
+        <w:rPr>
+          <w:rFonts w:ascii="Arial" w:cs="Arial" w:eastAsia="Arial" w:hAnsi="Arial"/>
+          <w:color w:val="16181C"/>
+          <w:sz w:val="18"/>
+          <w:szCs w:val="18"/>
+        </w:rPr>
+        <w:t xml:space="preserve">Guardrails (discloses it is AI; no prices or medical advice; never claims a booking), per-IP rate limiting, and model fallback.</w:t>
       </w:r>
     </w:p>
     <w:p>

</xml_diff>

<commit_message>
Résumé: blue clickable email/LinkedIn, www LinkedIn URL, VYBE link to product site
vybe-app-blue.vercel.app's root now serves a different page, so the
project link points at /variation5.

Co-Authored-By: Claude Opus 5.5 <noreply@anthropic.com>
</commit_message>
<xml_diff>
--- a/public/Emmanuel_Nanadoum_Solutions_Engineer_Resume.docx
+++ b/public/Emmanuel_Nanadoum_Solutions_Engineer_Resume.docx
@@ -53,7 +53,7 @@
         </w:rPr>
         <w:t xml:space="preserve"> | </w:t>
       </w:r>
-      <w:hyperlink w:history="1" r:id="rIdzz_waef6hkxlx0ymsgaqn">
+      <w:hyperlink w:history="1" r:id="rId6pjom8wd_jihsoybmbqg5">
         <w:r>
           <w:rPr>
             <w:rFonts w:ascii="Arial" w:cs="Arial" w:eastAsia="Arial" w:hAnsi="Arial"/>
@@ -73,13 +73,14 @@
         </w:rPr>
         <w:t xml:space="preserve"> | </w:t>
       </w:r>
-      <w:hyperlink w:history="1" r:id="rIdnfcq8topps2jmlrjdoz5k">
+      <w:hyperlink w:history="1" r:id="rIdtvntefp5nl5uofi9zudlj">
         <w:r>
           <w:rPr>
             <w:rFonts w:ascii="Arial" w:cs="Arial" w:eastAsia="Arial" w:hAnsi="Arial"/>
-            <w:color w:val="3D4047"/>
+            <w:color w:val="1D3FCF"/>
             <w:sz w:val="18"/>
             <w:szCs w:val="18"/>
+            <w:u w:val="single"/>
           </w:rPr>
           <w:t xml:space="preserve">nanadoum81@gmail.com</w:t>
         </w:r>
@@ -93,13 +94,14 @@
         </w:rPr>
         <w:t xml:space="preserve"> | </w:t>
       </w:r>
-      <w:hyperlink w:history="1" r:id="rIdekwybkjbd0fgwnqh_6aa5">
+      <w:hyperlink w:history="1" r:id="rIdreihth08dn3t_olj137jx">
         <w:r>
           <w:rPr>
             <w:rFonts w:ascii="Arial" w:cs="Arial" w:eastAsia="Arial" w:hAnsi="Arial"/>
-            <w:color w:val="3D4047"/>
+            <w:color w:val="1D3FCF"/>
             <w:sz w:val="18"/>
             <w:szCs w:val="18"/>
+            <w:u w:val="single"/>
           </w:rPr>
           <w:t xml:space="preserve">linkedin.com/in/emmanuel-nanadoum-7971b7a8</w:t>
         </w:r>
@@ -123,7 +125,7 @@
         </w:rPr>
         <w:t xml:space="preserve">Portfolio &amp; live demos: </w:t>
       </w:r>
-      <w:hyperlink w:history="1" r:id="rIdpkieuayfavvtr34cdknzc">
+      <w:hyperlink w:history="1" r:id="rIdrfkp2splrdgxdlkxxunlr">
         <w:r>
           <w:rPr>
             <w:rFonts w:ascii="Arial" w:cs="Arial" w:eastAsia="Arial" w:hAnsi="Arial"/>
@@ -729,7 +731,7 @@
         </w:rPr>
         <w:t xml:space="preserve">	</w:t>
       </w:r>
-      <w:hyperlink w:history="1" r:id="rIds3xxk-iri0gv18ktrfdmc">
+      <w:hyperlink w:history="1" r:id="rIdjumf1c5leua3dwzxq7mjk">
         <w:r>
           <w:rPr>
             <w:rFonts w:ascii="Arial" w:cs="Arial" w:eastAsia="Arial" w:hAnsi="Arial"/>
@@ -739,7 +741,7 @@
             <w:sz w:val="18"/>
             <w:szCs w:val="18"/>
           </w:rPr>
-          <w:t xml:space="preserve">vybe-app-blue.vercel.app</w:t>
+          <w:t xml:space="preserve">vybe-app-blue.vercel.app/variation5</w:t>
         </w:r>
       </w:hyperlink>
     </w:p>
@@ -808,7 +810,7 @@
         </w:rPr>
         <w:t xml:space="preserve">	</w:t>
       </w:r>
-      <w:hyperlink w:history="1" r:id="rId1jb_f4xj6ckbhwtvse6cm">
+      <w:hyperlink w:history="1" r:id="rIddpw7euufifzouucy5xvlx">
         <w:r>
           <w:rPr>
             <w:rFonts w:ascii="Arial" w:cs="Arial" w:eastAsia="Arial" w:hAnsi="Arial"/>

</xml_diff>